<commit_message>
Updated API Messages Assignment.
</commit_message>
<xml_diff>
--- a/00_Project_Management/assignments/Milestone_4_Interfaces_and_Data_Structures/M4_Part_2_API_Message_Specifications_Assignments.docx
+++ b/00_Project_Management/assignments/Milestone_4_Interfaces_and_Data_Structures/M4_Part_2_API_Message_Specifications_Assignments.docx
@@ -186,7 +186,7 @@
           <w:bCs/>
           <w:lang w:eastAsia="en-US"/>
         </w:rPr>
-        <w:t>8</w:t>
+        <w:t xml:space="preserve">Minimum </w:t>
       </w:r>
       <w:r>
         <w:rPr>
@@ -195,7 +195,7 @@
           <w:bCs/>
           <w:lang w:eastAsia="en-US"/>
         </w:rPr>
-        <w:t xml:space="preserve"> </w:t>
+        <w:t>8</w:t>
       </w:r>
       <w:r>
         <w:rPr>
@@ -204,7 +204,61 @@
           <w:bCs/>
           <w:lang w:eastAsia="en-US"/>
         </w:rPr>
+        <w:t xml:space="preserve"> </w:t>
+      </w:r>
+      <w:r>
+        <w:rPr>
+          <w:rFonts w:eastAsia="Times New Roman" w:cs="Times New Roman"/>
+          <w:b/>
+          <w:bCs/>
+          <w:lang w:eastAsia="en-US"/>
+        </w:rPr>
         <w:t>API Messages</w:t>
+      </w:r>
+      <w:r>
+        <w:rPr>
+          <w:rFonts w:eastAsia="Times New Roman" w:cs="Times New Roman"/>
+          <w:b/>
+          <w:bCs/>
+          <w:lang w:eastAsia="en-US"/>
+        </w:rPr>
+        <w:t xml:space="preserve"> (All API Messages </w:t>
+      </w:r>
+      <w:r>
+        <w:rPr>
+          <w:rFonts w:eastAsia="Times New Roman" w:cs="Times New Roman"/>
+          <w:b/>
+          <w:bCs/>
+          <w:lang w:eastAsia="en-US"/>
+        </w:rPr>
+        <w:t xml:space="preserve">needed </w:t>
+      </w:r>
+      <w:r>
+        <w:rPr>
+          <w:rFonts w:eastAsia="Times New Roman" w:cs="Times New Roman"/>
+          <w:b/>
+          <w:bCs/>
+          <w:lang w:eastAsia="en-US"/>
+        </w:rPr>
+        <w:t>for the Component</w:t>
+      </w:r>
+      <w:r>
+        <w:rPr>
+          <w:rFonts w:eastAsia="Times New Roman" w:cs="Times New Roman"/>
+          <w:b/>
+          <w:bCs/>
+          <w:lang w:eastAsia="en-US"/>
+        </w:rPr>
+        <w:t>s</w:t>
+      </w:r>
+      <w:r>
+        <w:rPr>
+          <w:rFonts w:eastAsia="Times New Roman" w:cs="Times New Roman"/>
+          <w:b/>
+          <w:bCs/>
+          <w:lang w:eastAsia="en-US"/>
+        </w:rPr>
+        <w:t>)</w:t>
       </w:r>
     </w:p>
     <w:p>
@@ -258,6 +312,13 @@
           <w:lang w:eastAsia="en-US"/>
         </w:rPr>
         <w:t xml:space="preserve"> API messages</w:t>
+      </w:r>
+      <w:r>
+        <w:rPr>
+          <w:rFonts w:eastAsia="Times New Roman" w:cs="Times New Roman"/>
+          <w:lang w:eastAsia="en-US"/>
+        </w:rPr>
+        <w:t xml:space="preserve"> - minimum </w:t>
       </w:r>
     </w:p>
     <w:p>
@@ -969,10 +1030,7 @@
     </w:p>
     <w:p>
       <w:r>
-        <w:t>The milestone requires that network protocols be specified</w:t>
-      </w:r>
-      <w:r>
-        <w:t xml:space="preserve"> and to </w:t>
+        <w:t xml:space="preserve">The milestone requires that network protocols be specified and to </w:t>
       </w:r>
       <w:r>
         <w:t>completely describe how data is represented in the system</w:t>
@@ -1159,10 +1217,7 @@
         <w:pStyle w:val="GitHubProcesses"/>
       </w:pPr>
       <w:r>
-        <w:t>Assignment</w:t>
-      </w:r>
-      <w:r>
-        <w:t xml:space="preserve"> Instructions</w:t>
+        <w:t>Assignment Instructions</w:t>
       </w:r>
     </w:p>
     <w:p>
@@ -1261,16 +1316,7 @@
           <w:lang w:eastAsia="en-US"/>
         </w:rPr>
         <w:lastRenderedPageBreak/>
-        <w:t>A</w:t>
-      </w:r>
-      <w:r>
-        <w:rPr>
-          <w:rFonts w:eastAsia="Times New Roman" w:cs="Times New Roman"/>
-          <w:b/>
-          <w:bCs/>
-          <w:lang w:eastAsia="en-US"/>
-        </w:rPr>
-        <w:t>sk:</w:t>
+        <w:t>Ask:</w:t>
       </w:r>
     </w:p>
     <w:p>
@@ -1405,19 +1451,7 @@
         <w:rPr>
           <w:lang w:eastAsia="en-US"/>
         </w:rPr>
-        <w:t>"</w:t>
-      </w:r>
-      <w:r>
-        <w:rPr>
-          <w:lang w:eastAsia="en-US"/>
-        </w:rPr>
-        <w:t xml:space="preserve"> </w:t>
-      </w:r>
-      <w:r>
-        <w:rPr>
-          <w:lang w:eastAsia="en-US"/>
-        </w:rPr>
-        <w:t>CareerBound-SDD\05_Final_SDD\Working_Doc\JTS_CareerBound_SDD_v03.docx"</w:t>
+        <w:t>" CareerBound-SDD\05_Final_SDD\Working_Doc\JTS_CareerBound_SDD_v03.docx"</w:t>
       </w:r>
       <w:r>
         <w:rPr>
@@ -1478,19 +1512,7 @@
         <w:rPr>
           <w:lang w:eastAsia="en-US"/>
         </w:rPr>
-        <w:t>"</w:t>
-      </w:r>
-      <w:r>
-        <w:rPr>
-          <w:lang w:eastAsia="en-US"/>
-        </w:rPr>
-        <w:t xml:space="preserve"> </w:t>
-      </w:r>
-      <w:r>
-        <w:rPr>
-          <w:lang w:eastAsia="en-US"/>
-        </w:rPr>
-        <w:t>CareerBound-SDD\01_Standards\Milestone_4_Interfaces_and_Data_Structures\M4_API_Message_Specification_Standards.docx"</w:t>
+        <w:t>" CareerBound-SDD\01_Standards\Milestone_4_Interfaces_and_Data_Structures\M4_API_Message_Specification_Standards.docx"</w:t>
       </w:r>
     </w:p>
     <w:sectPr>

</xml_diff>